<commit_message>
Praktikum dan Tugas Mandiri 11
</commit_message>
<xml_diff>
--- a/Pertemuan 11/Materi & Tugas/Hisyam Wildan Alfath_0110222206_LaporanPraktikumMandiri11.docx
+++ b/Pertemuan 11/Materi & Tugas/Hisyam Wildan Alfath_0110222206_LaporanPraktikumMandiri11.docx
@@ -1779,6 +1779,7 @@
       <w:r>
         <w:rPr>
           <w:rFonts w:ascii="Times New Roman" w:hAnsi="Times New Roman" w:cs="Times New Roman"/>
+          <w:noProof/>
           <w:sz w:val="24"/>
           <w:szCs w:val="24"/>
         </w:rPr>
@@ -2269,7 +2270,6 @@
         <w:t xml:space="preserve"> </w:t>
       </w:r>
       <w:proofErr w:type="spellStart"/>
-      <w:proofErr w:type="gramStart"/>
       <w:r>
         <w:rPr>
           <w:rFonts w:ascii="Times New Roman" w:hAnsi="Times New Roman" w:cs="Times New Roman"/>
@@ -2285,16 +2285,7 @@
           <w:sz w:val="24"/>
           <w:szCs w:val="24"/>
         </w:rPr>
-        <w:t xml:space="preserve"> !pip</w:t>
-      </w:r>
-      <w:proofErr w:type="gramEnd"/>
-      <w:r>
-        <w:rPr>
-          <w:rFonts w:ascii="Times New Roman" w:hAnsi="Times New Roman" w:cs="Times New Roman"/>
-          <w:sz w:val="24"/>
-          <w:szCs w:val="24"/>
-        </w:rPr>
-        <w:t xml:space="preserve"> install folium, environment Colab </w:t>
+        <w:t xml:space="preserve"> !pip install folium, environment Colab </w:t>
       </w:r>
       <w:proofErr w:type="spellStart"/>
       <w:r>
@@ -2552,6 +2543,7 @@
       <w:r>
         <w:rPr>
           <w:rFonts w:ascii="Times New Roman" w:hAnsi="Times New Roman" w:cs="Times New Roman"/>
+          <w:noProof/>
           <w:sz w:val="24"/>
           <w:szCs w:val="24"/>
         </w:rPr>
@@ -2612,7 +2604,6 @@
         <w:tab/>
       </w:r>
       <w:proofErr w:type="spellStart"/>
-      <w:proofErr w:type="gramStart"/>
       <w:r>
         <w:rPr>
           <w:rFonts w:ascii="Times New Roman" w:hAnsi="Times New Roman" w:cs="Times New Roman"/>
@@ -2628,16 +2619,7 @@
           <w:sz w:val="24"/>
           <w:szCs w:val="24"/>
         </w:rPr>
-        <w:t xml:space="preserve"> !pip</w:t>
-      </w:r>
-      <w:proofErr w:type="gramEnd"/>
-      <w:r>
-        <w:rPr>
-          <w:rFonts w:ascii="Times New Roman" w:hAnsi="Times New Roman" w:cs="Times New Roman"/>
-          <w:sz w:val="24"/>
-          <w:szCs w:val="24"/>
-        </w:rPr>
-        <w:t xml:space="preserve"> install </w:t>
+        <w:t xml:space="preserve"> !pip install </w:t>
       </w:r>
       <w:proofErr w:type="spellStart"/>
       <w:r>
@@ -3344,6 +3326,7 @@
       <w:r>
         <w:rPr>
           <w:rFonts w:ascii="Times New Roman" w:hAnsi="Times New Roman" w:cs="Times New Roman"/>
+          <w:noProof/>
           <w:sz w:val="24"/>
           <w:szCs w:val="24"/>
         </w:rPr>
@@ -4268,6 +4251,7 @@
       <w:r>
         <w:rPr>
           <w:rFonts w:ascii="Times New Roman" w:hAnsi="Times New Roman" w:cs="Times New Roman"/>
+          <w:noProof/>
           <w:sz w:val="24"/>
           <w:szCs w:val="24"/>
         </w:rPr>
@@ -4632,7 +4616,6 @@
         <w:t xml:space="preserve"> </w:t>
       </w:r>
       <w:proofErr w:type="spellStart"/>
-      <w:proofErr w:type="gramStart"/>
       <w:r>
         <w:rPr>
           <w:rFonts w:ascii="Times New Roman" w:hAnsi="Times New Roman" w:cs="Times New Roman"/>
@@ -4642,7 +4625,6 @@
         <w:t>drive.mount</w:t>
       </w:r>
       <w:proofErr w:type="spellEnd"/>
-      <w:proofErr w:type="gramEnd"/>
       <w:r>
         <w:rPr>
           <w:rFonts w:ascii="Times New Roman" w:hAnsi="Times New Roman" w:cs="Times New Roman"/>
@@ -4933,6 +4915,7 @@
       <w:r>
         <w:rPr>
           <w:rFonts w:ascii="Times New Roman" w:hAnsi="Times New Roman" w:cs="Times New Roman"/>
+          <w:noProof/>
           <w:sz w:val="24"/>
           <w:szCs w:val="24"/>
         </w:rPr>
@@ -5117,50 +5100,22 @@
         <w:t xml:space="preserve"> </w:t>
       </w:r>
       <w:proofErr w:type="spellStart"/>
-      <w:proofErr w:type="gramStart"/>
-      <w:r>
-        <w:rPr>
-          <w:rFonts w:ascii="Times New Roman" w:hAnsi="Times New Roman" w:cs="Times New Roman"/>
-          <w:sz w:val="24"/>
-          <w:szCs w:val="24"/>
-        </w:rPr>
-        <w:t>pd.read</w:t>
-      </w:r>
-      <w:proofErr w:type="gramEnd"/>
-      <w:r>
-        <w:rPr>
-          <w:rFonts w:ascii="Times New Roman" w:hAnsi="Times New Roman" w:cs="Times New Roman"/>
-          <w:sz w:val="24"/>
-          <w:szCs w:val="24"/>
-        </w:rPr>
-        <w:t>_</w:t>
-      </w:r>
-      <w:proofErr w:type="gramStart"/>
-      <w:r>
-        <w:rPr>
-          <w:rFonts w:ascii="Times New Roman" w:hAnsi="Times New Roman" w:cs="Times New Roman"/>
-          <w:sz w:val="24"/>
-          <w:szCs w:val="24"/>
-        </w:rPr>
-        <w:t>csv</w:t>
-      </w:r>
-      <w:proofErr w:type="spellEnd"/>
-      <w:r>
-        <w:rPr>
-          <w:rFonts w:ascii="Times New Roman" w:hAnsi="Times New Roman" w:cs="Times New Roman"/>
-          <w:sz w:val="24"/>
-          <w:szCs w:val="24"/>
-        </w:rPr>
-        <w:t>(</w:t>
-      </w:r>
-      <w:proofErr w:type="gramEnd"/>
-      <w:r>
-        <w:rPr>
-          <w:rFonts w:ascii="Times New Roman" w:hAnsi="Times New Roman" w:cs="Times New Roman"/>
-          <w:sz w:val="24"/>
-          <w:szCs w:val="24"/>
-        </w:rPr>
-        <w:t xml:space="preserve">). </w:t>
+      <w:r>
+        <w:rPr>
+          <w:rFonts w:ascii="Times New Roman" w:hAnsi="Times New Roman" w:cs="Times New Roman"/>
+          <w:sz w:val="24"/>
+          <w:szCs w:val="24"/>
+        </w:rPr>
+        <w:t>pd.read_csv</w:t>
+      </w:r>
+      <w:proofErr w:type="spellEnd"/>
+      <w:r>
+        <w:rPr>
+          <w:rFonts w:ascii="Times New Roman" w:hAnsi="Times New Roman" w:cs="Times New Roman"/>
+          <w:sz w:val="24"/>
+          <w:szCs w:val="24"/>
+        </w:rPr>
+        <w:t xml:space="preserve">(). </w:t>
       </w:r>
       <w:proofErr w:type="spellStart"/>
       <w:r>
@@ -5307,7 +5262,6 @@
         <w:t xml:space="preserve"> </w:t>
       </w:r>
       <w:proofErr w:type="spellStart"/>
-      <w:proofErr w:type="gramStart"/>
       <w:r>
         <w:rPr>
           <w:rFonts w:ascii="Times New Roman" w:hAnsi="Times New Roman" w:cs="Times New Roman"/>
@@ -5317,7 +5271,6 @@
         <w:t>df.head</w:t>
       </w:r>
       <w:proofErr w:type="spellEnd"/>
-      <w:proofErr w:type="gramEnd"/>
       <w:r>
         <w:rPr>
           <w:rFonts w:ascii="Times New Roman" w:hAnsi="Times New Roman" w:cs="Times New Roman"/>
@@ -5951,25 +5904,7 @@
           <w:sz w:val="24"/>
           <w:szCs w:val="24"/>
         </w:rPr>
-        <w:t xml:space="preserve"> </w:t>
-      </w:r>
-      <w:proofErr w:type="gramStart"/>
-      <w:r>
-        <w:rPr>
-          <w:rFonts w:ascii="Times New Roman" w:hAnsi="Times New Roman" w:cs="Times New Roman"/>
-          <w:sz w:val="24"/>
-          <w:szCs w:val="24"/>
-        </w:rPr>
-        <w:t>df.info(</w:t>
-      </w:r>
-      <w:proofErr w:type="gramEnd"/>
-      <w:r>
-        <w:rPr>
-          <w:rFonts w:ascii="Times New Roman" w:hAnsi="Times New Roman" w:cs="Times New Roman"/>
-          <w:sz w:val="24"/>
-          <w:szCs w:val="24"/>
-        </w:rPr>
-        <w:t>)</w:t>
+        <w:t xml:space="preserve"> df.info()</w:t>
       </w:r>
     </w:p>
     <w:p>
@@ -5987,6 +5922,7 @@
       <w:r>
         <w:rPr>
           <w:rFonts w:ascii="Times New Roman" w:hAnsi="Times New Roman" w:cs="Times New Roman"/>
+          <w:noProof/>
           <w:sz w:val="24"/>
           <w:szCs w:val="24"/>
         </w:rPr>
@@ -6062,25 +5998,7 @@
           <w:sz w:val="24"/>
           <w:szCs w:val="24"/>
         </w:rPr>
-        <w:t xml:space="preserve"> </w:t>
-      </w:r>
-      <w:proofErr w:type="gramStart"/>
-      <w:r>
-        <w:rPr>
-          <w:rFonts w:ascii="Times New Roman" w:hAnsi="Times New Roman" w:cs="Times New Roman"/>
-          <w:sz w:val="24"/>
-          <w:szCs w:val="24"/>
-        </w:rPr>
-        <w:t>df.info(</w:t>
-      </w:r>
-      <w:proofErr w:type="gramEnd"/>
-      <w:r>
-        <w:rPr>
-          <w:rFonts w:ascii="Times New Roman" w:hAnsi="Times New Roman" w:cs="Times New Roman"/>
-          <w:sz w:val="24"/>
-          <w:szCs w:val="24"/>
-        </w:rPr>
-        <w:t xml:space="preserve">) </w:t>
+        <w:t xml:space="preserve"> df.info() </w:t>
       </w:r>
       <w:proofErr w:type="spellStart"/>
       <w:r>
@@ -7068,6 +6986,7 @@
       <w:r>
         <w:rPr>
           <w:rFonts w:ascii="Times New Roman" w:hAnsi="Times New Roman" w:cs="Times New Roman"/>
+          <w:noProof/>
           <w:sz w:val="24"/>
           <w:szCs w:val="24"/>
         </w:rPr>
@@ -7146,7 +7065,6 @@
         <w:t xml:space="preserve"> </w:t>
       </w:r>
       <w:proofErr w:type="spellStart"/>
-      <w:proofErr w:type="gramStart"/>
       <w:r>
         <w:rPr>
           <w:rFonts w:ascii="Times New Roman" w:hAnsi="Times New Roman" w:cs="Times New Roman"/>
@@ -7156,7 +7074,6 @@
         <w:t>df.columns</w:t>
       </w:r>
       <w:proofErr w:type="spellEnd"/>
-      <w:proofErr w:type="gramEnd"/>
       <w:r>
         <w:rPr>
           <w:rFonts w:ascii="Times New Roman" w:hAnsi="Times New Roman" w:cs="Times New Roman"/>
@@ -7952,6 +7869,7 @@
       <w:r>
         <w:rPr>
           <w:rFonts w:ascii="Times New Roman" w:hAnsi="Times New Roman" w:cs="Times New Roman"/>
+          <w:noProof/>
           <w:sz w:val="24"/>
           <w:szCs w:val="24"/>
         </w:rPr>
@@ -8048,7 +7966,6 @@
         <w:t xml:space="preserve"> </w:t>
       </w:r>
       <w:proofErr w:type="spellStart"/>
-      <w:proofErr w:type="gramStart"/>
       <w:r>
         <w:rPr>
           <w:rFonts w:ascii="Times New Roman" w:hAnsi="Times New Roman" w:cs="Times New Roman"/>
@@ -8058,32 +7975,13 @@
         <w:t>df.isnull</w:t>
       </w:r>
       <w:proofErr w:type="spellEnd"/>
-      <w:proofErr w:type="gramEnd"/>
-      <w:r>
-        <w:rPr>
-          <w:rFonts w:ascii="Times New Roman" w:hAnsi="Times New Roman" w:cs="Times New Roman"/>
-          <w:sz w:val="24"/>
-          <w:szCs w:val="24"/>
-        </w:rPr>
-        <w:t>(</w:t>
-      </w:r>
-      <w:proofErr w:type="gramStart"/>
-      <w:r>
-        <w:rPr>
-          <w:rFonts w:ascii="Times New Roman" w:hAnsi="Times New Roman" w:cs="Times New Roman"/>
-          <w:sz w:val="24"/>
-          <w:szCs w:val="24"/>
-        </w:rPr>
-        <w:t>).sum</w:t>
-      </w:r>
-      <w:proofErr w:type="gramEnd"/>
-      <w:r>
-        <w:rPr>
-          <w:rFonts w:ascii="Times New Roman" w:hAnsi="Times New Roman" w:cs="Times New Roman"/>
-          <w:sz w:val="24"/>
-          <w:szCs w:val="24"/>
-        </w:rPr>
-        <w:t xml:space="preserve">(), </w:t>
+      <w:r>
+        <w:rPr>
+          <w:rFonts w:ascii="Times New Roman" w:hAnsi="Times New Roman" w:cs="Times New Roman"/>
+          <w:sz w:val="24"/>
+          <w:szCs w:val="24"/>
+        </w:rPr>
+        <w:t xml:space="preserve">().sum(), </w:t>
       </w:r>
       <w:proofErr w:type="spellStart"/>
       <w:r>
@@ -9143,6 +9041,7 @@
       <w:r>
         <w:rPr>
           <w:rFonts w:ascii="Times New Roman" w:hAnsi="Times New Roman" w:cs="Times New Roman"/>
+          <w:noProof/>
           <w:sz w:val="24"/>
           <w:szCs w:val="24"/>
         </w:rPr>
@@ -9751,7 +9650,6 @@
         <w:t xml:space="preserve"> </w:t>
       </w:r>
       <w:proofErr w:type="spellStart"/>
-      <w:proofErr w:type="gramStart"/>
       <w:r>
         <w:rPr>
           <w:rFonts w:ascii="Times New Roman" w:hAnsi="Times New Roman" w:cs="Times New Roman"/>
@@ -9761,32 +9659,13 @@
         <w:t>df.isnull</w:t>
       </w:r>
       <w:proofErr w:type="spellEnd"/>
-      <w:proofErr w:type="gramEnd"/>
-      <w:r>
-        <w:rPr>
-          <w:rFonts w:ascii="Times New Roman" w:hAnsi="Times New Roman" w:cs="Times New Roman"/>
-          <w:sz w:val="24"/>
-          <w:szCs w:val="24"/>
-        </w:rPr>
-        <w:t>(</w:t>
-      </w:r>
-      <w:proofErr w:type="gramStart"/>
-      <w:r>
-        <w:rPr>
-          <w:rFonts w:ascii="Times New Roman" w:hAnsi="Times New Roman" w:cs="Times New Roman"/>
-          <w:sz w:val="24"/>
-          <w:szCs w:val="24"/>
-        </w:rPr>
-        <w:t>).sum</w:t>
-      </w:r>
-      <w:proofErr w:type="gramEnd"/>
-      <w:r>
-        <w:rPr>
-          <w:rFonts w:ascii="Times New Roman" w:hAnsi="Times New Roman" w:cs="Times New Roman"/>
-          <w:sz w:val="24"/>
-          <w:szCs w:val="24"/>
-        </w:rPr>
-        <w:t xml:space="preserve">() </w:t>
+      <w:r>
+        <w:rPr>
+          <w:rFonts w:ascii="Times New Roman" w:hAnsi="Times New Roman" w:cs="Times New Roman"/>
+          <w:sz w:val="24"/>
+          <w:szCs w:val="24"/>
+        </w:rPr>
+        <w:t xml:space="preserve">().sum() </w:t>
       </w:r>
       <w:proofErr w:type="spellStart"/>
       <w:r>
@@ -10279,6 +10158,7 @@
       <w:r>
         <w:rPr>
           <w:rFonts w:ascii="Times New Roman" w:hAnsi="Times New Roman" w:cs="Times New Roman"/>
+          <w:noProof/>
           <w:sz w:val="24"/>
           <w:szCs w:val="24"/>
         </w:rPr>
@@ -10942,7 +10822,6 @@
         <w:t xml:space="preserve"> </w:t>
       </w:r>
       <w:proofErr w:type="spellStart"/>
-      <w:proofErr w:type="gramStart"/>
       <w:r>
         <w:rPr>
           <w:rFonts w:ascii="Times New Roman" w:hAnsi="Times New Roman" w:cs="Times New Roman"/>
@@ -10958,16 +10837,7 @@
           <w:sz w:val="24"/>
           <w:szCs w:val="24"/>
         </w:rPr>
-        <w:t xml:space="preserve"> .replace</w:t>
-      </w:r>
-      <w:proofErr w:type="gramEnd"/>
-      <w:r>
-        <w:rPr>
-          <w:rFonts w:ascii="Times New Roman" w:hAnsi="Times New Roman" w:cs="Times New Roman"/>
-          <w:sz w:val="24"/>
-          <w:szCs w:val="24"/>
-        </w:rPr>
-        <w:t xml:space="preserve">(). Hasil </w:t>
+        <w:t xml:space="preserve"> .replace(). Hasil </w:t>
       </w:r>
       <w:proofErr w:type="spellStart"/>
       <w:r>
@@ -11039,25 +10909,7 @@
           <w:sz w:val="24"/>
           <w:szCs w:val="24"/>
         </w:rPr>
-        <w:t>['stage'</w:t>
-      </w:r>
-      <w:proofErr w:type="gramStart"/>
-      <w:r>
-        <w:rPr>
-          <w:rFonts w:ascii="Times New Roman" w:hAnsi="Times New Roman" w:cs="Times New Roman"/>
-          <w:sz w:val="24"/>
-          <w:szCs w:val="24"/>
-        </w:rPr>
-        <w:t>].unique</w:t>
-      </w:r>
-      <w:proofErr w:type="gramEnd"/>
-      <w:r>
-        <w:rPr>
-          <w:rFonts w:ascii="Times New Roman" w:hAnsi="Times New Roman" w:cs="Times New Roman"/>
-          <w:sz w:val="24"/>
-          <w:szCs w:val="24"/>
-        </w:rPr>
-        <w:t xml:space="preserve">() </w:t>
+        <w:t xml:space="preserve">['stage'].unique() </w:t>
       </w:r>
       <w:proofErr w:type="spellStart"/>
       <w:r>
@@ -11522,6 +11374,7 @@
       <w:r>
         <w:rPr>
           <w:rFonts w:ascii="Times New Roman" w:hAnsi="Times New Roman" w:cs="Times New Roman"/>
+          <w:noProof/>
           <w:sz w:val="24"/>
           <w:szCs w:val="24"/>
         </w:rPr>
@@ -11726,7 +11579,6 @@
         <w:t xml:space="preserve"> </w:t>
       </w:r>
       <w:proofErr w:type="spellStart"/>
-      <w:proofErr w:type="gramStart"/>
       <w:r>
         <w:rPr>
           <w:rFonts w:ascii="Times New Roman" w:hAnsi="Times New Roman" w:cs="Times New Roman"/>
@@ -11736,7 +11588,6 @@
         <w:t>df.head</w:t>
       </w:r>
       <w:proofErr w:type="spellEnd"/>
-      <w:proofErr w:type="gramEnd"/>
       <w:r>
         <w:rPr>
           <w:rFonts w:ascii="Times New Roman" w:hAnsi="Times New Roman" w:cs="Times New Roman"/>
@@ -12676,6 +12527,7 @@
       <w:r>
         <w:rPr>
           <w:rFonts w:ascii="Times New Roman" w:hAnsi="Times New Roman" w:cs="Times New Roman"/>
+          <w:noProof/>
           <w:sz w:val="24"/>
           <w:szCs w:val="24"/>
         </w:rPr>
@@ -13176,7 +13028,6 @@
         <w:t xml:space="preserve"> </w:t>
       </w:r>
       <w:proofErr w:type="spellStart"/>
-      <w:proofErr w:type="gramStart"/>
       <w:r>
         <w:rPr>
           <w:rFonts w:ascii="Times New Roman" w:hAnsi="Times New Roman" w:cs="Times New Roman"/>
@@ -13192,16 +13043,7 @@
           <w:sz w:val="24"/>
           <w:szCs w:val="24"/>
         </w:rPr>
-        <w:t>(</w:t>
-      </w:r>
-      <w:proofErr w:type="gramEnd"/>
-      <w:r>
-        <w:rPr>
-          <w:rFonts w:ascii="Times New Roman" w:hAnsi="Times New Roman" w:cs="Times New Roman"/>
-          <w:sz w:val="24"/>
-          <w:szCs w:val="24"/>
-        </w:rPr>
-        <w:t xml:space="preserve">), di mana </w:t>
+        <w:t xml:space="preserve">(), di mana </w:t>
       </w:r>
       <w:proofErr w:type="spellStart"/>
       <w:r>
@@ -13727,6 +13569,7 @@
       <w:r>
         <w:rPr>
           <w:rFonts w:ascii="Times New Roman" w:hAnsi="Times New Roman" w:cs="Times New Roman"/>
+          <w:noProof/>
           <w:sz w:val="24"/>
           <w:szCs w:val="24"/>
         </w:rPr>
@@ -14923,6 +14766,7 @@
       <w:r>
         <w:rPr>
           <w:rFonts w:ascii="Times New Roman" w:hAnsi="Times New Roman" w:cs="Times New Roman"/>
+          <w:noProof/>
           <w:sz w:val="24"/>
           <w:szCs w:val="24"/>
         </w:rPr>
@@ -16461,6 +16305,7 @@
       <w:r>
         <w:rPr>
           <w:rFonts w:ascii="Times New Roman" w:hAnsi="Times New Roman" w:cs="Times New Roman"/>
+          <w:noProof/>
           <w:sz w:val="24"/>
           <w:szCs w:val="24"/>
         </w:rPr>
@@ -17721,6 +17566,7 @@
       <w:r>
         <w:rPr>
           <w:rFonts w:ascii="Times New Roman" w:hAnsi="Times New Roman" w:cs="Times New Roman"/>
+          <w:noProof/>
           <w:sz w:val="24"/>
           <w:szCs w:val="24"/>
         </w:rPr>
@@ -18990,6 +18836,7 @@
       <w:r>
         <w:rPr>
           <w:rFonts w:ascii="Times New Roman" w:hAnsi="Times New Roman" w:cs="Times New Roman"/>
+          <w:noProof/>
           <w:sz w:val="24"/>
           <w:szCs w:val="24"/>
         </w:rPr>
@@ -20422,6 +20269,7 @@
       <w:r>
         <w:rPr>
           <w:rFonts w:ascii="Times New Roman" w:hAnsi="Times New Roman" w:cs="Times New Roman"/>
+          <w:noProof/>
           <w:sz w:val="24"/>
           <w:szCs w:val="24"/>
         </w:rPr>
@@ -21180,34 +21028,16 @@
           <w:sz w:val="24"/>
           <w:szCs w:val="24"/>
         </w:rPr>
-        <w:t>pd.to_</w:t>
-      </w:r>
-      <w:proofErr w:type="gramStart"/>
-      <w:r>
-        <w:rPr>
-          <w:rFonts w:ascii="Times New Roman" w:hAnsi="Times New Roman" w:cs="Times New Roman"/>
-          <w:sz w:val="24"/>
-          <w:szCs w:val="24"/>
-        </w:rPr>
-        <w:t>numeric</w:t>
-      </w:r>
-      <w:proofErr w:type="spellEnd"/>
-      <w:r>
-        <w:rPr>
-          <w:rFonts w:ascii="Times New Roman" w:hAnsi="Times New Roman" w:cs="Times New Roman"/>
-          <w:sz w:val="24"/>
-          <w:szCs w:val="24"/>
-        </w:rPr>
-        <w:t>(</w:t>
-      </w:r>
-      <w:proofErr w:type="gramEnd"/>
-      <w:r>
-        <w:rPr>
-          <w:rFonts w:ascii="Times New Roman" w:hAnsi="Times New Roman" w:cs="Times New Roman"/>
-          <w:sz w:val="24"/>
-          <w:szCs w:val="24"/>
-        </w:rPr>
-        <w:t xml:space="preserve">), </w:t>
+        <w:t>pd.to_numeric</w:t>
+      </w:r>
+      <w:proofErr w:type="spellEnd"/>
+      <w:r>
+        <w:rPr>
+          <w:rFonts w:ascii="Times New Roman" w:hAnsi="Times New Roman" w:cs="Times New Roman"/>
+          <w:sz w:val="24"/>
+          <w:szCs w:val="24"/>
+        </w:rPr>
+        <w:t xml:space="preserve">(), </w:t>
       </w:r>
       <w:proofErr w:type="spellStart"/>
       <w:r>
@@ -21315,25 +21145,7 @@
           <w:sz w:val="24"/>
           <w:szCs w:val="24"/>
         </w:rPr>
-        <w:t xml:space="preserve">. Hasil </w:t>
-      </w:r>
-      <w:proofErr w:type="gramStart"/>
-      <w:r>
-        <w:rPr>
-          <w:rFonts w:ascii="Times New Roman" w:hAnsi="Times New Roman" w:cs="Times New Roman"/>
-          <w:sz w:val="24"/>
-          <w:szCs w:val="24"/>
-        </w:rPr>
-        <w:t>normalityTest_df.info(</w:t>
-      </w:r>
-      <w:proofErr w:type="gramEnd"/>
-      <w:r>
-        <w:rPr>
-          <w:rFonts w:ascii="Times New Roman" w:hAnsi="Times New Roman" w:cs="Times New Roman"/>
-          <w:sz w:val="24"/>
-          <w:szCs w:val="24"/>
-        </w:rPr>
-        <w:t xml:space="preserve">) </w:t>
+        <w:t xml:space="preserve">. Hasil normalityTest_df.info() </w:t>
       </w:r>
       <w:proofErr w:type="spellStart"/>
       <w:r>
@@ -21690,6 +21502,7 @@
       <w:r>
         <w:rPr>
           <w:rFonts w:ascii="Times New Roman" w:hAnsi="Times New Roman" w:cs="Times New Roman"/>
+          <w:noProof/>
           <w:sz w:val="24"/>
           <w:szCs w:val="24"/>
         </w:rPr>
@@ -22922,6 +22735,7 @@
       <w:r>
         <w:rPr>
           <w:rFonts w:ascii="Times New Roman" w:hAnsi="Times New Roman" w:cs="Times New Roman"/>
+          <w:noProof/>
           <w:sz w:val="24"/>
           <w:szCs w:val="24"/>
         </w:rPr>
@@ -24226,6 +24040,7 @@
       <w:r>
         <w:rPr>
           <w:rFonts w:ascii="Times New Roman" w:hAnsi="Times New Roman" w:cs="Times New Roman"/>
+          <w:noProof/>
           <w:sz w:val="24"/>
           <w:szCs w:val="24"/>
         </w:rPr>
@@ -25512,6 +25327,7 @@
       <w:r>
         <w:rPr>
           <w:rFonts w:ascii="Times New Roman" w:hAnsi="Times New Roman" w:cs="Times New Roman"/>
+          <w:noProof/>
           <w:sz w:val="24"/>
           <w:szCs w:val="24"/>
         </w:rPr>
@@ -26691,6 +26507,7 @@
       <w:r>
         <w:rPr>
           <w:rFonts w:ascii="Times New Roman" w:hAnsi="Times New Roman" w:cs="Times New Roman"/>
+          <w:noProof/>
           <w:sz w:val="24"/>
           <w:szCs w:val="24"/>
         </w:rPr>
@@ -26975,7 +26792,6 @@
         <w:t xml:space="preserve"> </w:t>
       </w:r>
       <w:proofErr w:type="spellStart"/>
-      <w:proofErr w:type="gramStart"/>
       <w:r>
         <w:rPr>
           <w:rFonts w:ascii="Times New Roman" w:hAnsi="Times New Roman" w:cs="Times New Roman"/>
@@ -26985,7 +26801,6 @@
         <w:t>sns.regplot</w:t>
       </w:r>
       <w:proofErr w:type="spellEnd"/>
-      <w:proofErr w:type="gramEnd"/>
       <w:r>
         <w:rPr>
           <w:rFonts w:ascii="Times New Roman" w:hAnsi="Times New Roman" w:cs="Times New Roman"/>
@@ -28005,6 +27820,7 @@
       <w:r>
         <w:rPr>
           <w:rFonts w:ascii="Times New Roman" w:hAnsi="Times New Roman" w:cs="Times New Roman"/>
+          <w:noProof/>
           <w:sz w:val="24"/>
           <w:szCs w:val="24"/>
         </w:rPr>
@@ -29229,6 +29045,7 @@
       <w:r>
         <w:rPr>
           <w:rFonts w:ascii="Times New Roman" w:hAnsi="Times New Roman" w:cs="Times New Roman"/>
+          <w:noProof/>
           <w:sz w:val="24"/>
           <w:szCs w:val="24"/>
         </w:rPr>
@@ -29979,52 +29796,16 @@
           <w:sz w:val="24"/>
           <w:szCs w:val="24"/>
         </w:rPr>
-        <w:t>pd.to_</w:t>
-      </w:r>
-      <w:proofErr w:type="gramStart"/>
-      <w:r>
-        <w:rPr>
-          <w:rFonts w:ascii="Times New Roman" w:hAnsi="Times New Roman" w:cs="Times New Roman"/>
-          <w:sz w:val="24"/>
-          <w:szCs w:val="24"/>
-        </w:rPr>
-        <w:t>numeric</w:t>
-      </w:r>
-      <w:proofErr w:type="spellEnd"/>
-      <w:r>
-        <w:rPr>
-          <w:rFonts w:ascii="Times New Roman" w:hAnsi="Times New Roman" w:cs="Times New Roman"/>
-          <w:sz w:val="24"/>
-          <w:szCs w:val="24"/>
-        </w:rPr>
-        <w:t>(</w:t>
-      </w:r>
-      <w:proofErr w:type="gramEnd"/>
-      <w:r>
-        <w:rPr>
-          <w:rFonts w:ascii="Times New Roman" w:hAnsi="Times New Roman" w:cs="Times New Roman"/>
-          <w:sz w:val="24"/>
-          <w:szCs w:val="24"/>
-        </w:rPr>
-        <w:t xml:space="preserve">). Hasil </w:t>
-      </w:r>
-      <w:proofErr w:type="gramStart"/>
-      <w:r>
-        <w:rPr>
-          <w:rFonts w:ascii="Times New Roman" w:hAnsi="Times New Roman" w:cs="Times New Roman"/>
-          <w:sz w:val="24"/>
-          <w:szCs w:val="24"/>
-        </w:rPr>
-        <w:t>normalisasi_df.info(</w:t>
-      </w:r>
-      <w:proofErr w:type="gramEnd"/>
-      <w:r>
-        <w:rPr>
-          <w:rFonts w:ascii="Times New Roman" w:hAnsi="Times New Roman" w:cs="Times New Roman"/>
-          <w:sz w:val="24"/>
-          <w:szCs w:val="24"/>
-        </w:rPr>
-        <w:t xml:space="preserve">) </w:t>
+        <w:t>pd.to_numeric</w:t>
+      </w:r>
+      <w:proofErr w:type="spellEnd"/>
+      <w:r>
+        <w:rPr>
+          <w:rFonts w:ascii="Times New Roman" w:hAnsi="Times New Roman" w:cs="Times New Roman"/>
+          <w:sz w:val="24"/>
+          <w:szCs w:val="24"/>
+        </w:rPr>
+        <w:t xml:space="preserve">(). Hasil normalisasi_df.info() </w:t>
       </w:r>
       <w:proofErr w:type="spellStart"/>
       <w:r>
@@ -30399,6 +30180,7 @@
       <w:r>
         <w:rPr>
           <w:rFonts w:ascii="Times New Roman" w:hAnsi="Times New Roman" w:cs="Times New Roman"/>
+          <w:noProof/>
           <w:sz w:val="24"/>
           <w:szCs w:val="24"/>
         </w:rPr>
@@ -31077,19 +30859,9 @@
           <w:sz w:val="24"/>
           <w:szCs w:val="24"/>
         </w:rPr>
-        <w:t>normalisasi_</w:t>
-      </w:r>
-      <w:proofErr w:type="gramStart"/>
-      <w:r>
-        <w:rPr>
-          <w:rFonts w:ascii="Times New Roman" w:hAnsi="Times New Roman" w:cs="Times New Roman"/>
-          <w:sz w:val="24"/>
-          <w:szCs w:val="24"/>
-        </w:rPr>
-        <w:t>df.head</w:t>
-      </w:r>
-      <w:proofErr w:type="spellEnd"/>
-      <w:proofErr w:type="gramEnd"/>
+        <w:t>normalisasi_df.head</w:t>
+      </w:r>
+      <w:proofErr w:type="spellEnd"/>
       <w:r>
         <w:rPr>
           <w:rFonts w:ascii="Times New Roman" w:hAnsi="Times New Roman" w:cs="Times New Roman"/>
@@ -31597,6 +31369,7 @@
       <w:r>
         <w:rPr>
           <w:rFonts w:ascii="Times New Roman" w:hAnsi="Times New Roman" w:cs="Times New Roman"/>
+          <w:noProof/>
           <w:sz w:val="24"/>
           <w:szCs w:val="24"/>
         </w:rPr>
@@ -32640,6 +32413,7 @@
       <w:r>
         <w:rPr>
           <w:rFonts w:ascii="Times New Roman" w:hAnsi="Times New Roman" w:cs="Times New Roman"/>
+          <w:noProof/>
           <w:sz w:val="24"/>
           <w:szCs w:val="24"/>
         </w:rPr>
@@ -33970,6 +33744,7 @@
       <w:r>
         <w:rPr>
           <w:rFonts w:ascii="Times New Roman" w:hAnsi="Times New Roman" w:cs="Times New Roman"/>
+          <w:noProof/>
           <w:sz w:val="24"/>
           <w:szCs w:val="24"/>
         </w:rPr>
@@ -35022,6 +34797,7 @@
       <w:r>
         <w:rPr>
           <w:rFonts w:ascii="Times New Roman" w:hAnsi="Times New Roman" w:cs="Times New Roman"/>
+          <w:noProof/>
           <w:sz w:val="24"/>
           <w:szCs w:val="24"/>
         </w:rPr>
@@ -36255,6 +36031,7 @@
       <w:r>
         <w:rPr>
           <w:rFonts w:ascii="Times New Roman" w:hAnsi="Times New Roman" w:cs="Times New Roman"/>
+          <w:noProof/>
           <w:sz w:val="24"/>
           <w:szCs w:val="24"/>
         </w:rPr>
@@ -37371,6 +37148,7 @@
       <w:r>
         <w:rPr>
           <w:rFonts w:ascii="Times New Roman" w:hAnsi="Times New Roman" w:cs="Times New Roman"/>
+          <w:noProof/>
           <w:sz w:val="24"/>
           <w:szCs w:val="24"/>
         </w:rPr>
@@ -38675,6 +38453,7 @@
       <w:r>
         <w:rPr>
           <w:rFonts w:ascii="Times New Roman" w:hAnsi="Times New Roman" w:cs="Times New Roman"/>
+          <w:noProof/>
           <w:sz w:val="24"/>
           <w:szCs w:val="24"/>
         </w:rPr>
@@ -40185,6 +39964,7 @@
       <w:r>
         <w:rPr>
           <w:rFonts w:ascii="Times New Roman" w:hAnsi="Times New Roman" w:cs="Times New Roman"/>
+          <w:noProof/>
           <w:sz w:val="24"/>
           <w:szCs w:val="24"/>
         </w:rPr>
@@ -41687,6 +41467,7 @@
       <w:r>
         <w:rPr>
           <w:rFonts w:ascii="Times New Roman" w:hAnsi="Times New Roman" w:cs="Times New Roman"/>
+          <w:noProof/>
           <w:sz w:val="24"/>
           <w:szCs w:val="24"/>
         </w:rPr>
@@ -44354,7 +44135,7 @@
             <w:sz w:val="24"/>
             <w:szCs w:val="24"/>
           </w:rPr>
-          <w:t>https://www.kaggle.com/datasets/greegtitan/school-dataset-idn/code</w:t>
+          <w:t>https://www.kaggle.com/datasets/greegtitan/school-dataset-idn/</w:t>
         </w:r>
       </w:hyperlink>
     </w:p>
@@ -44366,8 +44147,8 @@
         <w:jc w:val="both"/>
         <w:rPr>
           <w:rFonts w:ascii="Times New Roman" w:hAnsi="Times New Roman" w:cs="Times New Roman"/>
-          <w:sz w:val="24"/>
-          <w:szCs w:val="24"/>
+          <w:sz w:val="28"/>
+          <w:szCs w:val="28"/>
         </w:rPr>
       </w:pPr>
     </w:p>
@@ -44454,7 +44235,7 @@
             <w:sz w:val="24"/>
             <w:szCs w:val="24"/>
           </w:rPr>
-          <w:t>https://github.com/HisyamWildan/TI03_HisyamW.A_0110222206/blob/main/Pertemuan%2010/Praktikum%20dan%20Tugas%20Mandiri%2010/notebooks/praktikum10.ipynb</w:t>
+          <w:t>https://github.com/HisyamWildan/TI03_HisyamW.A_0110222206/blob/main/Pertemuan%2011/Praktikum%20dan%20Tugas%20Mandiri%2011/notebooks/praktikum11.ipynb</w:t>
         </w:r>
       </w:hyperlink>
     </w:p>
@@ -44466,8 +44247,8 @@
         <w:jc w:val="both"/>
         <w:rPr>
           <w:rFonts w:ascii="Times New Roman" w:hAnsi="Times New Roman" w:cs="Times New Roman"/>
-          <w:sz w:val="28"/>
-          <w:szCs w:val="28"/>
+          <w:sz w:val="24"/>
+          <w:szCs w:val="24"/>
         </w:rPr>
       </w:pPr>
     </w:p>
@@ -44564,7 +44345,7 @@
             <w:sz w:val="24"/>
             <w:szCs w:val="24"/>
           </w:rPr>
-          <w:t>https://github.com/HisyamWildan/TI03_HisyamW.A_0110222206/blob/main/Pertemuan%2010/Praktikum%20dan%20Tugas%20Mandiri%2010/notebooks/latihan10.ipynb</w:t>
+          <w:t>https://github.com/HisyamWildan/TI03_HisyamW.A_0110222206/blob/main/Pertemuan%2011/Praktikum%20dan%20Tugas%20Mandiri%2011/notebooks/latihan11.ipynb</w:t>
         </w:r>
       </w:hyperlink>
     </w:p>
@@ -44576,8 +44357,8 @@
         <w:jc w:val="both"/>
         <w:rPr>
           <w:rFonts w:ascii="Times New Roman" w:hAnsi="Times New Roman" w:cs="Times New Roman"/>
-          <w:sz w:val="28"/>
-          <w:szCs w:val="28"/>
+          <w:sz w:val="24"/>
+          <w:szCs w:val="24"/>
         </w:rPr>
       </w:pPr>
     </w:p>
@@ -46938,7 +46719,6 @@
   <w:style w:type="character" w:default="1" w:styleId="DefaultParagraphFont">
     <w:name w:val="Default Paragraph Font"/>
     <w:uiPriority w:val="1"/>
-    <w:semiHidden/>
     <w:unhideWhenUsed/>
   </w:style>
   <w:style w:type="table" w:default="1" w:styleId="TableNormal">
@@ -47926,10 +47706,48 @@
 </file>
 
 <file path=customXml/item1.xml><?xml version="1.0" encoding="utf-8"?>
+<?mso-contentType ?>
+<FormTemplates xmlns="http://schemas.microsoft.com/sharepoint/v3/contenttype/forms">
+  <Display>DocumentLibraryForm</Display>
+  <Edit>DocumentLibraryForm</Edit>
+  <New>DocumentLibraryForm</New>
+</FormTemplates>
+</file>
+
+<file path=customXml/item2.xml><?xml version="1.0" encoding="utf-8"?>
+<p:properties xmlns:p="http://schemas.microsoft.com/office/2006/metadata/properties" xmlns:xsi="http://www.w3.org/2001/XMLSchema-instance" xmlns:pc="http://schemas.microsoft.com/office/infopath/2007/PartnerControls">
+  <documentManagement>
+    <lcf76f155ced4ddcb4097134ff3c332f xmlns="0d0ca077-4a5a-44b3-8225-e973392463e8">
+      <Terms xmlns="http://schemas.microsoft.com/office/infopath/2007/PartnerControls"/>
+    </lcf76f155ced4ddcb4097134ff3c332f>
+    <TaxCatchAll xmlns="cd0cb0cd-f387-4546-b6ee-941c869211de" xsi:nil="true"/>
+    <MediaLengthInSeconds xmlns="0d0ca077-4a5a-44b3-8225-e973392463e8" xsi:nil="true"/>
+    <SharedWithUsers xmlns="cd0cb0cd-f387-4546-b6ee-941c869211de">
+      <UserInfo>
+        <DisplayName>Chris Ingle</DisplayName>
+        <AccountId>15</AccountId>
+        <AccountType/>
+      </UserInfo>
+      <UserInfo>
+        <DisplayName>Rosalind Barrett</DisplayName>
+        <AccountId>41</AccountId>
+        <AccountType/>
+      </UserInfo>
+      <UserInfo>
+        <DisplayName>Caroline Fitzgerald</DisplayName>
+        <AccountId>25</AccountId>
+        <AccountType/>
+      </UserInfo>
+    </SharedWithUsers>
+  </documentManagement>
+</p:properties>
+</file>
+
+<file path=customXml/item3.xml><?xml version="1.0" encoding="utf-8"?>
 <b:Sources xmlns:b="http://schemas.openxmlformats.org/officeDocument/2006/bibliography" xmlns="http://schemas.openxmlformats.org/officeDocument/2006/bibliography" SelectedStyle="\APASixthEditionOfficeOnline.xsl" StyleName="APA" Version="6"/>
 </file>
 
-<file path=customXml/item2.xml><?xml version="1.0" encoding="utf-8"?>
+<file path=customXml/item4.xml><?xml version="1.0" encoding="utf-8"?>
 <ct:contentTypeSchema xmlns:ct="http://schemas.microsoft.com/office/2006/metadata/contentType" xmlns:ma="http://schemas.microsoft.com/office/2006/metadata/properties/metaAttributes" ct:_="" ma:_="" ma:contentTypeName="Document" ma:contentTypeID="0x01010032184C1F9DAC6447BDEA3721DE969FCB" ma:contentTypeVersion="18" ma:contentTypeDescription="Create a new document." ma:contentTypeScope="" ma:versionID="793b80367c14023430c193f947ce3f0e">
   <xsd:schema xmlns:xsd="http://www.w3.org/2001/XMLSchema" xmlns:xs="http://www.w3.org/2001/XMLSchema" xmlns:p="http://schemas.microsoft.com/office/2006/metadata/properties" xmlns:ns2="0d0ca077-4a5a-44b3-8225-e973392463e8" xmlns:ns3="cd0cb0cd-f387-4546-b6ee-941c869211de" targetNamespace="http://schemas.microsoft.com/office/2006/metadata/properties" ma:root="true" ma:fieldsID="304ec480d0c6d264986323110b7a94b1" ns2:_="" ns3:_="">
     <xsd:import namespace="0d0ca077-4a5a-44b3-8225-e973392463e8"/>
@@ -48184,45 +48002,26 @@
 </ct:contentTypeSchema>
 </file>
 
-<file path=customXml/item3.xml><?xml version="1.0" encoding="utf-8"?>
-<p:properties xmlns:p="http://schemas.microsoft.com/office/2006/metadata/properties" xmlns:xsi="http://www.w3.org/2001/XMLSchema-instance" xmlns:pc="http://schemas.microsoft.com/office/infopath/2007/PartnerControls">
-  <documentManagement>
-    <lcf76f155ced4ddcb4097134ff3c332f xmlns="0d0ca077-4a5a-44b3-8225-e973392463e8">
-      <Terms xmlns="http://schemas.microsoft.com/office/infopath/2007/PartnerControls"/>
-    </lcf76f155ced4ddcb4097134ff3c332f>
-    <TaxCatchAll xmlns="cd0cb0cd-f387-4546-b6ee-941c869211de" xsi:nil="true"/>
-    <MediaLengthInSeconds xmlns="0d0ca077-4a5a-44b3-8225-e973392463e8" xsi:nil="true"/>
-    <SharedWithUsers xmlns="cd0cb0cd-f387-4546-b6ee-941c869211de">
-      <UserInfo>
-        <DisplayName>Chris Ingle</DisplayName>
-        <AccountId>15</AccountId>
-        <AccountType/>
-      </UserInfo>
-      <UserInfo>
-        <DisplayName>Rosalind Barrett</DisplayName>
-        <AccountId>41</AccountId>
-        <AccountType/>
-      </UserInfo>
-      <UserInfo>
-        <DisplayName>Caroline Fitzgerald</DisplayName>
-        <AccountId>25</AccountId>
-        <AccountType/>
-      </UserInfo>
-    </SharedWithUsers>
-  </documentManagement>
-</p:properties>
+<file path=customXml/itemProps1.xml><?xml version="1.0" encoding="utf-8"?>
+<ds:datastoreItem xmlns:ds="http://schemas.openxmlformats.org/officeDocument/2006/customXml" ds:itemID="{83A6A22A-9C14-46B9-AD3D-D6F73AC43EE6}">
+  <ds:schemaRefs>
+    <ds:schemaRef ds:uri="http://schemas.microsoft.com/sharepoint/v3/contenttype/forms"/>
+  </ds:schemaRefs>
+</ds:datastoreItem>
 </file>
 
-<file path=customXml/item4.xml><?xml version="1.0" encoding="utf-8"?>
-<?mso-contentType ?>
-<FormTemplates xmlns="http://schemas.microsoft.com/sharepoint/v3/contenttype/forms">
-  <Display>DocumentLibraryForm</Display>
-  <Edit>DocumentLibraryForm</Edit>
-  <New>DocumentLibraryForm</New>
-</FormTemplates>
+<file path=customXml/itemProps2.xml><?xml version="1.0" encoding="utf-8"?>
+<ds:datastoreItem xmlns:ds="http://schemas.openxmlformats.org/officeDocument/2006/customXml" ds:itemID="{D6C064DB-E98E-412C-AF48-DFED7351B3B6}">
+  <ds:schemaRefs>
+    <ds:schemaRef ds:uri="http://schemas.microsoft.com/office/2006/metadata/properties"/>
+    <ds:schemaRef ds:uri="http://schemas.microsoft.com/office/infopath/2007/PartnerControls"/>
+    <ds:schemaRef ds:uri="0d0ca077-4a5a-44b3-8225-e973392463e8"/>
+    <ds:schemaRef ds:uri="cd0cb0cd-f387-4546-b6ee-941c869211de"/>
+  </ds:schemaRefs>
+</ds:datastoreItem>
 </file>
 
-<file path=customXml/itemProps1.xml><?xml version="1.0" encoding="utf-8"?>
+<file path=customXml/itemProps3.xml><?xml version="1.0" encoding="utf-8"?>
 <ds:datastoreItem xmlns:ds="http://schemas.openxmlformats.org/officeDocument/2006/customXml" ds:itemID="{23BE1332-FFED-42EF-9329-B2D14A929D27}">
   <ds:schemaRefs>
     <ds:schemaRef ds:uri="http://schemas.openxmlformats.org/officeDocument/2006/bibliography"/>
@@ -48230,7 +48029,7 @@
 </ds:datastoreItem>
 </file>
 
-<file path=customXml/itemProps2.xml><?xml version="1.0" encoding="utf-8"?>
+<file path=customXml/itemProps4.xml><?xml version="1.0" encoding="utf-8"?>
 <ds:datastoreItem xmlns:ds="http://schemas.openxmlformats.org/officeDocument/2006/customXml" ds:itemID="{858A8F9A-2B86-4366-B5C0-20C41A4411FA}">
   <ds:schemaRefs>
     <ds:schemaRef ds:uri="http://schemas.microsoft.com/office/2006/metadata/contentType"/>
@@ -48247,23 +48046,4 @@
     <ds:schemaRef ds:uri="http://schemas.microsoft.com/internal/obd"/>
   </ds:schemaRefs>
 </ds:datastoreItem>
-</file>
-
-<file path=customXml/itemProps3.xml><?xml version="1.0" encoding="utf-8"?>
-<ds:datastoreItem xmlns:ds="http://schemas.openxmlformats.org/officeDocument/2006/customXml" ds:itemID="{D6C064DB-E98E-412C-AF48-DFED7351B3B6}">
-  <ds:schemaRefs>
-    <ds:schemaRef ds:uri="http://schemas.microsoft.com/office/2006/metadata/properties"/>
-    <ds:schemaRef ds:uri="http://schemas.microsoft.com/office/infopath/2007/PartnerControls"/>
-    <ds:schemaRef ds:uri="0d0ca077-4a5a-44b3-8225-e973392463e8"/>
-    <ds:schemaRef ds:uri="cd0cb0cd-f387-4546-b6ee-941c869211de"/>
-  </ds:schemaRefs>
-</ds:datastoreItem>
-</file>
-
-<file path=customXml/itemProps4.xml><?xml version="1.0" encoding="utf-8"?>
-<ds:datastoreItem xmlns:ds="http://schemas.openxmlformats.org/officeDocument/2006/customXml" ds:itemID="{83A6A22A-9C14-46B9-AD3D-D6F73AC43EE6}">
-  <ds:schemaRefs>
-    <ds:schemaRef ds:uri="http://schemas.microsoft.com/sharepoint/v3/contenttype/forms"/>
-  </ds:schemaRefs>
-</ds:datastoreItem>
 </file>
</xml_diff>